<commit_message>
refactor: enhance entity parser and improve contract generation
- Expand entity_list_parser with improved variant handling
- Enhance GUI with better entity list management
- Add entity_list_variants fixture for comprehensive testing
- Update principle_docx_filler logic
- Remove legacy .doc format template
- Add generated contract samples and spec file
- Add planning documentation for principle contracts

Co-Authored-By: Claude Haiku 4.5 <noreply@anthropic.com>
</commit_message>
<xml_diff>
--- a/HỢP ĐỒNG NGUYÊN TẮC mẫu.docx
+++ b/HỢP ĐỒNG NGUYÊN TẮC mẫu.docx
@@ -858,6 +858,262 @@
                 <w:lang w:val="vi-VN" w:eastAsia="zh-CN"/>
               </w:rPr>
               <w:t>0302629806</w:t>
+            </w:r>
+          </w:p>
+        </w:tc>
+      </w:tr>
+      <w:tr>
+        <w:trPr>
+          <w:gridAfter w:val="1"/>
+          <w:wAfter w:w="5928" w:type="dxa"/>
+        </w:trPr>
+        <w:tc>
+          <w:tcPr>
+            <w:tcW w:w="2268" w:type="dxa"/>
+          </w:tcPr>
+          <w:p>
+            <w:pPr>
+              <w:widowControl w:val="0"/>
+              <w:spacing w:line="360" w:lineRule="auto"/>
+              <w:jc w:val="both"/>
+              <w:rPr>
+                <w:rFonts w:ascii="Times New Roman" w:hAnsi="Times New Roman" w:cs="Times New Roman"/>
+                <w:bCs/>
+                <w:sz w:val="24"/>
+                <w:szCs w:val="24"/>
+              </w:rPr>
+            </w:pPr>
+            <w:proofErr w:type="spellStart"/>
+            <w:r>
+              <w:rPr>
+                <w:rFonts w:ascii="Times New Roman" w:hAnsi="Times New Roman" w:cs="Times New Roman"/>
+                <w:bCs/>
+                <w:sz w:val="24"/>
+                <w:szCs w:val="24"/>
+              </w:rPr>
+              <w:t>Tài khoản số</w:t>
+            </w:r>
+            <w:proofErr w:type="spellEnd"/>
+            <w:r>
+              <w:rPr>
+                <w:rFonts w:ascii="Times New Roman" w:hAnsi="Times New Roman" w:cs="Times New Roman"/>
+                <w:bCs/>
+                <w:sz w:val="24"/>
+                <w:szCs w:val="24"/>
+              </w:rPr>
+            </w:r>
+            <w:proofErr w:type="spellStart"/>
+            <w:r>
+              <w:rPr>
+                <w:rFonts w:ascii="Times New Roman" w:hAnsi="Times New Roman" w:cs="Times New Roman"/>
+                <w:bCs/>
+                <w:sz w:val="24"/>
+                <w:szCs w:val="24"/>
+              </w:rPr>
+            </w:r>
+            <w:proofErr w:type="spellEnd"/>
+            <w:r>
+              <w:rPr>
+                <w:rFonts w:ascii="Times New Roman" w:hAnsi="Times New Roman" w:cs="Times New Roman"/>
+                <w:bCs/>
+                <w:sz w:val="24"/>
+                <w:szCs w:val="24"/>
+              </w:rPr>
+            </w:r>
+            <w:proofErr w:type="spellStart"/>
+            <w:r>
+              <w:rPr>
+                <w:rFonts w:ascii="Times New Roman" w:hAnsi="Times New Roman" w:cs="Times New Roman"/>
+                <w:bCs/>
+                <w:sz w:val="24"/>
+                <w:szCs w:val="24"/>
+              </w:rPr>
+            </w:r>
+            <w:proofErr w:type="spellEnd"/>
+          </w:p>
+        </w:tc>
+        <w:tc>
+          <w:tcPr>
+            <w:tcW w:w="567" w:type="dxa"/>
+          </w:tcPr>
+          <w:p>
+            <w:pPr>
+              <w:widowControl w:val="0"/>
+              <w:spacing w:line="360" w:lineRule="auto"/>
+              <w:jc w:val="both"/>
+              <w:rPr>
+                <w:rFonts w:ascii="Times New Roman" w:hAnsi="Times New Roman" w:cs="Times New Roman"/>
+                <w:bCs/>
+                <w:sz w:val="24"/>
+                <w:szCs w:val="24"/>
+              </w:rPr>
+            </w:pPr>
+            <w:r>
+              <w:rPr>
+                <w:rFonts w:ascii="Times New Roman" w:hAnsi="Times New Roman" w:cs="Times New Roman"/>
+                <w:bCs/>
+                <w:sz w:val="24"/>
+                <w:szCs w:val="24"/>
+              </w:rPr>
+              <w:t>:</w:t>
+            </w:r>
+          </w:p>
+        </w:tc>
+        <w:tc>
+          <w:tcPr>
+            <w:tcW w:w="7229" w:type="dxa"/>
+            <w:gridSpan w:val="2"/>
+          </w:tcPr>
+          <w:p>
+            <w:pPr>
+              <w:suppressAutoHyphens w:val="0"/>
+              <w:spacing w:line="240" w:lineRule="auto"/>
+              <w:jc w:val="both"/>
+              <w:rPr>
+                <w:rFonts w:ascii="Times New Roman" w:hAnsi="Times New Roman" w:cs="Times New Roman"/>
+                <w:color w:val="FF0000"/>
+                <w:sz w:val="24"/>
+                <w:szCs w:val="24"/>
+                <w:lang w:val="vi-VN" w:eastAsia="zh-CN"/>
+              </w:rPr>
+            </w:pPr>
+            <w:r>
+              <w:rPr>
+                <w:rFonts w:ascii="Times New Roman" w:hAnsi="Times New Roman" w:cs="Times New Roman"/>
+                <w:color w:val="FF0000"/>
+                <w:sz w:val="24"/>
+                <w:szCs w:val="24"/>
+                <w:lang w:val="vi-VN" w:eastAsia="zh-CN"/>
+              </w:rPr>
+              <w:t>898896886</w:t>
+            </w:r>
+          </w:p>
+        </w:tc>
+      </w:tr>
+      <w:tr>
+        <w:trPr>
+          <w:gridAfter w:val="1"/>
+          <w:wAfter w:w="5928" w:type="dxa"/>
+        </w:trPr>
+        <w:tc>
+          <w:tcPr>
+            <w:tcW w:w="2268" w:type="dxa"/>
+          </w:tcPr>
+          <w:p>
+            <w:pPr>
+              <w:widowControl w:val="0"/>
+              <w:spacing w:line="360" w:lineRule="auto"/>
+              <w:jc w:val="both"/>
+              <w:rPr>
+                <w:rFonts w:ascii="Times New Roman" w:hAnsi="Times New Roman" w:cs="Times New Roman"/>
+                <w:bCs/>
+                <w:sz w:val="24"/>
+                <w:szCs w:val="24"/>
+              </w:rPr>
+            </w:pPr>
+            <w:proofErr w:type="spellStart"/>
+            <w:r>
+              <w:rPr>
+                <w:rFonts w:ascii="Times New Roman" w:hAnsi="Times New Roman" w:cs="Times New Roman"/>
+                <w:bCs/>
+                <w:sz w:val="24"/>
+                <w:szCs w:val="24"/>
+              </w:rPr>
+              <w:t>Mở tại ngân hàng</w:t>
+            </w:r>
+            <w:proofErr w:type="spellEnd"/>
+            <w:r>
+              <w:rPr>
+                <w:rFonts w:ascii="Times New Roman" w:hAnsi="Times New Roman" w:cs="Times New Roman"/>
+                <w:bCs/>
+                <w:sz w:val="24"/>
+                <w:szCs w:val="24"/>
+              </w:rPr>
+            </w:r>
+            <w:proofErr w:type="spellStart"/>
+            <w:r>
+              <w:rPr>
+                <w:rFonts w:ascii="Times New Roman" w:hAnsi="Times New Roman" w:cs="Times New Roman"/>
+                <w:bCs/>
+                <w:sz w:val="24"/>
+                <w:szCs w:val="24"/>
+              </w:rPr>
+            </w:r>
+            <w:proofErr w:type="spellEnd"/>
+            <w:r>
+              <w:rPr>
+                <w:rFonts w:ascii="Times New Roman" w:hAnsi="Times New Roman" w:cs="Times New Roman"/>
+                <w:bCs/>
+                <w:sz w:val="24"/>
+                <w:szCs w:val="24"/>
+              </w:rPr>
+            </w:r>
+            <w:proofErr w:type="spellStart"/>
+            <w:r>
+              <w:rPr>
+                <w:rFonts w:ascii="Times New Roman" w:hAnsi="Times New Roman" w:cs="Times New Roman"/>
+                <w:bCs/>
+                <w:sz w:val="24"/>
+                <w:szCs w:val="24"/>
+              </w:rPr>
+            </w:r>
+            <w:proofErr w:type="spellEnd"/>
+          </w:p>
+        </w:tc>
+        <w:tc>
+          <w:tcPr>
+            <w:tcW w:w="567" w:type="dxa"/>
+          </w:tcPr>
+          <w:p>
+            <w:pPr>
+              <w:widowControl w:val="0"/>
+              <w:spacing w:line="360" w:lineRule="auto"/>
+              <w:jc w:val="both"/>
+              <w:rPr>
+                <w:rFonts w:ascii="Times New Roman" w:hAnsi="Times New Roman" w:cs="Times New Roman"/>
+                <w:bCs/>
+                <w:sz w:val="24"/>
+                <w:szCs w:val="24"/>
+              </w:rPr>
+            </w:pPr>
+            <w:r>
+              <w:rPr>
+                <w:rFonts w:ascii="Times New Roman" w:hAnsi="Times New Roman" w:cs="Times New Roman"/>
+                <w:bCs/>
+                <w:sz w:val="24"/>
+                <w:szCs w:val="24"/>
+              </w:rPr>
+              <w:t>:</w:t>
+            </w:r>
+          </w:p>
+        </w:tc>
+        <w:tc>
+          <w:tcPr>
+            <w:tcW w:w="7229" w:type="dxa"/>
+            <w:gridSpan w:val="2"/>
+          </w:tcPr>
+          <w:p>
+            <w:pPr>
+              <w:suppressAutoHyphens w:val="0"/>
+              <w:spacing w:line="240" w:lineRule="auto"/>
+              <w:jc w:val="both"/>
+              <w:rPr>
+                <w:rFonts w:ascii="Times New Roman" w:hAnsi="Times New Roman" w:cs="Times New Roman"/>
+                <w:color w:val="FF0000"/>
+                <w:sz w:val="24"/>
+                <w:szCs w:val="24"/>
+                <w:lang w:val="vi-VN" w:eastAsia="zh-CN"/>
+              </w:rPr>
+            </w:pPr>
+            <w:r>
+              <w:rPr>
+                <w:rFonts w:ascii="Times New Roman" w:hAnsi="Times New Roman" w:cs="Times New Roman"/>
+                <w:color w:val="FF0000"/>
+                <w:sz w:val="24"/>
+                <w:szCs w:val="24"/>
+                <w:lang w:val="vi-VN" w:eastAsia="zh-CN"/>
+              </w:rPr>
+              <w:t>Ngân hàng TMCP QUÂN ĐỘI - MBANK</w:t>
             </w:r>
           </w:p>
         </w:tc>

</xml_diff>